<commit_message>
Fix CI: install NumPy before the equal-work benchmark; add division of work
- build-and-test failed at the equal-work step with ModuleNotFoundError: numpy
- add actions/setup-python (3.12) and pip install numpy to the workflow
- add CONTRIBUTION.md and Division_of_Work PDF/DOCX with the full part allocation
- add Section 28.5 to the final review so the paper matches the allocation
- link the new documents from README.md and TEAM.md
</commit_message>
<xml_diff>
--- a/docs/Energy_Aware_CPU_Scheduling_Final_38_Pages.docx
+++ b/docs/Energy_Aware_CPU_Scheduling_Final_38_Pages.docx
@@ -6101,6 +6101,54 @@
       </w:pPr>
       <w:r>
         <w:t>The code, the analysis and this document are the original work of the team, except for the openly licensed third-party libraries declared in requirements.txt and the published works cited in the annotated bibliography. No hardware measurement, third-party dataset, human-subject data or generative text service was used to produce the reported results. Where a figure from another work informed the design, it is cited at the point of use. The team accepts responsibility for the limitations stated in Section 29 and for the accuracy of the reproduction commands in Appendix A.</w:t>
+      </w:r>
+    </w:p>
+    <w:p>
+      <w:pPr>
+        <w:pStyle w:val="Heading2"/>
+      </w:pPr>
+      <w:r>
+        <w:t>28.5 Detailed division of work</w:t>
+      </w:r>
+    </w:p>
+    <w:p>
+      <w:r>
+        <w:t>The page-by-page allocation is recorded in CONTRIBUTION.md and in the standalone Division of Work document. In summary:</w:t>
+      </w:r>
+    </w:p>
+    <w:p>
+      <w:r>
+        <w:t>Part I (pp. 1-8) - Aditya Rajeshwar Karn: front matter and Sections 1-6.</w:t>
+      </w:r>
+    </w:p>
+    <w:p>
+      <w:r>
+        <w:t>Part II (pp. 9-15) - Yuvraj Singh: Sections 7-13.</w:t>
+      </w:r>
+    </w:p>
+    <w:p>
+      <w:r>
+        <w:t>Part III (pp. 16-22) - Aditya Singh: Sections 14-20.</w:t>
+      </w:r>
+    </w:p>
+    <w:p>
+      <w:r>
+        <w:t>Part IV (pp. 23-29) - Atharva Sivaraman: Sections 21-25.</w:t>
+      </w:r>
+    </w:p>
+    <w:p>
+      <w:r>
+        <w:t>Part V (pp. 30-35) - Yash Jain: Sections 26-29 and Appendices A-B.</w:t>
+      </w:r>
+    </w:p>
+    <w:p>
+      <w:r>
+        <w:t>Part VI (pp. 36-38) - shared: five annotated references verified per member.</w:t>
+      </w:r>
+    </w:p>
+    <w:p>
+      <w:r>
+        <w:t>Yash Jain is the document editor; each author is accountable for their own part.</w:t>
       </w:r>
     </w:p>
     <w:p>

</xml_diff>